<commit_message>
Trim project report to required scope and verify references
</commit_message>
<xml_diff>
--- a/docs/classroom/final/Project-Report.docx
+++ b/docs/classroom/final/Project-Report.docx
@@ -502,255 +502,6 @@
     </w:p>
     <w:p>
       <w:pPr>
-        <w:pStyle w:val="Title"/>
-        <w:pageBreakBefore/>
-        <w:widowControl/>
-      </w:pPr>
-      <w:r>
-        <w:rPr>
-          <w:b w:val="0"/>
-        </w:rPr>
-        <w:t>Contents</w:t>
-      </w:r>
-    </w:p>
-    <w:p>
-      <w:pPr>
-        <w:tabs>
-          <w:tab w:pos="8712" w:val="right"/>
-        </w:tabs>
-        <w:spacing w:after="160"/>
-      </w:pPr>
-      <w:r>
-        <w:t>1 Abstract</w:t>
-        <w:tab/>
-        <w:t>3</w:t>
-      </w:r>
-    </w:p>
-    <w:p>
-      <w:pPr>
-        <w:tabs>
-          <w:tab w:pos="8712" w:val="right"/>
-        </w:tabs>
-        <w:spacing w:after="160"/>
-      </w:pPr>
-      <w:r>
-        <w:t>2 Introduction</w:t>
-        <w:tab/>
-        <w:t>3</w:t>
-      </w:r>
-    </w:p>
-    <w:p>
-      <w:pPr>
-        <w:tabs>
-          <w:tab w:pos="8712" w:val="right"/>
-        </w:tabs>
-        <w:spacing w:after="160"/>
-      </w:pPr>
-      <w:r>
-        <w:t>3 Problem Statement</w:t>
-        <w:tab/>
-        <w:t>4</w:t>
-      </w:r>
-    </w:p>
-    <w:p>
-      <w:pPr>
-        <w:tabs>
-          <w:tab w:pos="8712" w:val="right"/>
-        </w:tabs>
-        <w:spacing w:after="160"/>
-      </w:pPr>
-      <w:r>
-        <w:t>4 Objectives</w:t>
-        <w:tab/>
-        <w:t>4</w:t>
-      </w:r>
-    </w:p>
-    <w:p>
-      <w:pPr>
-        <w:tabs>
-          <w:tab w:pos="8712" w:val="right"/>
-        </w:tabs>
-        <w:spacing w:after="160"/>
-      </w:pPr>
-      <w:r>
-        <w:t>5 Dataset Description</w:t>
-        <w:tab/>
-        <w:t>5</w:t>
-      </w:r>
-    </w:p>
-    <w:p>
-      <w:pPr>
-        <w:tabs>
-          <w:tab w:pos="8712" w:val="right"/>
-        </w:tabs>
-        <w:spacing w:after="160"/>
-      </w:pPr>
-      <w:r>
-        <w:t>6 Methodology</w:t>
-        <w:tab/>
-        <w:t>6</w:t>
-      </w:r>
-    </w:p>
-    <w:p>
-      <w:pPr>
-        <w:tabs>
-          <w:tab w:pos="8712" w:val="right"/>
-        </w:tabs>
-        <w:spacing w:after="160"/>
-      </w:pPr>
-      <w:r>
-        <w:t>7 Data Preprocessing</w:t>
-        <w:tab/>
-        <w:t>8</w:t>
-      </w:r>
-    </w:p>
-    <w:p>
-      <w:pPr>
-        <w:tabs>
-          <w:tab w:pos="8712" w:val="right"/>
-        </w:tabs>
-        <w:spacing w:after="160"/>
-      </w:pPr>
-      <w:r>
-        <w:t>8 Exploratory Data Analysis</w:t>
-        <w:tab/>
-        <w:t>9</w:t>
-      </w:r>
-    </w:p>
-    <w:p>
-      <w:pPr>
-        <w:tabs>
-          <w:tab w:pos="8712" w:val="right"/>
-        </w:tabs>
-        <w:spacing w:after="160"/>
-      </w:pPr>
-      <w:r>
-        <w:t>9 Models Used</w:t>
-        <w:tab/>
-        <w:t>11</w:t>
-      </w:r>
-    </w:p>
-    <w:p>
-      <w:pPr>
-        <w:tabs>
-          <w:tab w:pos="8712" w:val="right"/>
-        </w:tabs>
-        <w:spacing w:after="160"/>
-      </w:pPr>
-      <w:r>
-        <w:t>10 Results and Evaluation</w:t>
-        <w:tab/>
-        <w:t>12</w:t>
-      </w:r>
-    </w:p>
-    <w:p>
-      <w:pPr>
-        <w:tabs>
-          <w:tab w:pos="8712" w:val="right"/>
-        </w:tabs>
-        <w:spacing w:after="160"/>
-      </w:pPr>
-      <w:r>
-        <w:t>11 Discussion</w:t>
-        <w:tab/>
-        <w:t>14</w:t>
-      </w:r>
-    </w:p>
-    <w:p>
-      <w:pPr>
-        <w:tabs>
-          <w:tab w:pos="8712" w:val="right"/>
-        </w:tabs>
-        <w:spacing w:after="160"/>
-      </w:pPr>
-      <w:r>
-        <w:t>12 Conclusion</w:t>
-        <w:tab/>
-        <w:t>16</w:t>
-      </w:r>
-    </w:p>
-    <w:p>
-      <w:pPr>
-        <w:tabs>
-          <w:tab w:pos="8712" w:val="right"/>
-        </w:tabs>
-        <w:spacing w:after="160"/>
-      </w:pPr>
-      <w:r>
-        <w:t>13 References</w:t>
-        <w:tab/>
-        <w:t>17</w:t>
-      </w:r>
-    </w:p>
-    <w:p>
-      <w:pPr>
-        <w:pStyle w:val="Heading2"/>
-        <w:widowControl/>
-      </w:pPr>
-      <w:r>
-        <w:rPr>
-          <w:b w:val="0"/>
-        </w:rPr>
-        <w:t>Figures and tables</w:t>
-      </w:r>
-    </w:p>
-    <w:p>
-      <w:pPr>
-        <w:widowControl/>
-      </w:pPr>
-      <w:r>
-        <w:rPr>
-          <w:b w:val="0"/>
-        </w:rPr>
-        <w:t>Figure 1  Fine retrieval processing schematic</w:t>
-      </w:r>
-    </w:p>
-    <w:p>
-      <w:pPr>
-        <w:widowControl/>
-      </w:pPr>
-      <w:r>
-        <w:rPr>
-          <w:b w:val="0"/>
-        </w:rPr>
-        <w:t>Figure 2  Geographic distribution of training and test positions</w:t>
-      </w:r>
-    </w:p>
-    <w:p>
-      <w:pPr>
-        <w:widowControl/>
-      </w:pPr>
-      <w:r>
-        <w:rPr>
-          <w:b w:val="0"/>
-        </w:rPr>
-        <w:t>Figure 3  Training class frequency distribution</w:t>
-      </w:r>
-    </w:p>
-    <w:p>
-      <w:pPr>
-        <w:widowControl/>
-      </w:pPr>
-      <w:r>
-        <w:rPr>
-          <w:b w:val="0"/>
-        </w:rPr>
-        <w:t>Figure 4  Official test error distribution</w:t>
-      </w:r>
-    </w:p>
-    <w:p>
-      <w:pPr>
-        <w:widowControl/>
-      </w:pPr>
-      <w:r>
-        <w:rPr>
-          <w:b w:val="0"/>
-        </w:rPr>
-        <w:t>Tables describe dataset subsets, the illustrative KNN blend, spatial separation, current results and comparison with existing methods.</w:t>
-      </w:r>
-    </w:p>
-    <w:p>
-      <w:pPr>
         <w:pStyle w:val="Heading1"/>
         <w:pageBreakBefore/>
         <w:widowControl/>
@@ -792,18 +543,7 @@
         <w:rPr>
           <w:b w:val="0"/>
         </w:rPr>
-        <w:t>The system also provides an interactive image upload, method comparison, geographic display, retrieved-reference view and Google Maps link. Spatial analysis shows that random validation contains many locations near training images, making it easier than the official test. We therefore separate validation and test claims, document the reused benchmark, and report unsuccessful prototype and additional-data experiments without presenting them as deployed improvements. [1, 6, 7]</w:t>
-      </w:r>
-    </w:p>
-    <w:p>
-      <w:pPr>
-        <w:widowControl/>
-      </w:pPr>
-      <w:r>
-        <w:rPr>
-          <w:b w:val="0"/>
-        </w:rPr>
-        <w:t>Keywords: visual geolocation, Kerala, ResNet-50, DINOv2, image retrieval, nearest neighbors.</w:t>
+        <w:t>The application displays the returned location, the matched reference when available, and a Google Maps link. Spatial analysis shows that validation images are much closer to training locations than official test images; validation and test performance are therefore reported separately. [1, 6, 7]</w:t>
       </w:r>
     </w:p>
     <w:p>
@@ -848,7 +588,7 @@
         <w:rPr>
           <w:b w:val="0"/>
         </w:rPr>
-        <w:t>The project emphasizes an auditable connection between model behavior and evaluation. A map marker, a high similarity score and several successful examples are not substitutes for distance-based testing. Our report therefore explains the complete pipeline, the role of KNN in the regional selector, the observed geographic distribution of the data, and the limits of the current measurements. The scope is the Kerala-area implementation and its regional alternatives; no worldwide performance claim is made.</w:t>
+        <w:t>The report covers the implemented Kerala-area methods, their data preparation and evaluation. Geographic error measures how close the returned coordinate is to the recorded test location.</w:t>
       </w:r>
     </w:p>
     <w:p>
@@ -872,7 +612,7 @@
         <w:rPr>
           <w:b w:val="0"/>
         </w:rPr>
-        <w:t>Given one RGB photograph without using its GPS metadata, estimate a geographic location from visual evidence within the project's regional coverage. The inference function must accept image pixels, apply a saved model and return a coordinate that can be displayed and inspected. For evaluation only, a known reference coordinate is available to measure error.</w:t>
+        <w:t>Given one RGB photograph without using its GPS metadata, estimate a geographic location from visual evidence within the project's regional coverage. The output is a coordinate suitable for display on a map. During evaluation, the recorded test coordinate provides the ground truth.</w:t>
       </w:r>
     </w:p>
     <w:p>
@@ -883,7 +623,7 @@
         <w:rPr>
           <w:b w:val="0"/>
         </w:rPr>
-        <w:t>The central challenge is that appearance does not uniquely identify geography. Similar roads, vegetation and building styles can occur far apart, while two views of the same place may differ because of viewpoint, lighting, weather or occlusion. Sparse or geographically concentrated references make this problem harder. The system must also distinguish the meaning of its output: a geographic class center is not the observed position of a query, and a retrieved reference's coordinate need not equal the query camera's position.</w:t>
+        <w:t>Similar roads, vegetation and buildings can occur far apart, while viewpoint, lighting, weather and occlusion change the appearance of one place. Sparse reference coverage further limits accuracy. A predicted class center or reference coordinate is an estimate, not the measured camera position of the query.</w:t>
       </w:r>
     </w:p>
     <w:p>
@@ -905,7 +645,7 @@
         <w:rPr>
           <w:b w:val="0"/>
         </w:rPr>
-        <w:t>We evaluate usefulness through the distribution of haversine errors rather than through the number of decimal places in a coordinate. Successful localization at a radius r means that the predicted position lies at most r kilometers from the recorded test position. Exact-cell accuracy and visual similarity scores answer different questions and must not be substituted for this measure.</w:t>
+        <w:t>Successful localization within radius r means that the returned coordinate is at most r kilometers from the recorded test position. This distance criterion differs from exact-class accuracy and visual similarity.</w:t>
       </w:r>
     </w:p>
     <w:p>
@@ -928,7 +668,7 @@
         <w:rPr>
           <w:b w:val="0"/>
         </w:rPr>
-        <w:t>The project has the following operational objectives.</w:t>
+        <w:t>The project objectives are:</w:t>
       </w:r>
     </w:p>
     <w:p>
@@ -999,17 +739,6 @@
     </w:p>
     <w:p>
       <w:pPr>
-        <w:widowControl/>
-      </w:pPr>
-      <w:r>
-        <w:rPr>
-          <w:b w:val="0"/>
-        </w:rPr>
-        <w:t>7. Investigate additional imagery and geographic prototypes under explicit deployment conditions, retaining the working method when an experiment does not satisfy those conditions.</w:t>
-      </w:r>
-    </w:p>
-    <w:p>
-      <w:pPr>
         <w:pStyle w:val="Heading1"/>
         <w:pageBreakBefore/>
         <w:widowControl/>
@@ -1041,7 +770,7 @@
         <w:rPr>
           <w:b w:val="0"/>
         </w:rPr>
-        <w:t>OSV-5M is an open benchmark of georeferenced street-view images. Its published design uses geographic separation between source training and test sets, making it suitable for studying geographic generalization rather than only matching duplicate views. We use the pinned dataset revision cff33609b56b54d8743b7ee7a416eb8433e9a681 and retain the source image IDs for traceability. The dataset card specifies the CC BY-SA 4.0 license. [1, 8]</w:t>
+        <w:t>OSV-5M is an open benchmark of georeferenced street-view images. Its published design uses geographic separation between source training and test sets, making it suitable for studying geographic generalization rather than only matching duplicate views. Source image IDs are retained for traceability. The dataset card specifies CC BY-SA 4.0; the dataset revision is recorded in Reference [8]. [1, 8]</w:t>
       </w:r>
     </w:p>
     <w:p>
@@ -1052,7 +781,7 @@
         <w:rPr>
           <w:b w:val="0"/>
         </w:rPr>
-        <w:t>Our extraction selects positions inside the regional rectangle. From 16,939 source-training entries, a seed-42 holdout selects 1,000 validation images and leaves 15,939 training images. A further 357 regional images come from the official test archives. The validation images retain source-training storage paths, but they are excluded from regional fitting and from the deployed retrieval banks. Source directory names alone therefore do not identify an example's experimental role.</w:t>
+        <w:t>Our extraction selects positions inside the regional rectangle. From 16,939 source-training entries, a seed-42 holdout selects 1,000 validation images and leaves 15,939 training images. A further 357 regional images come from the official test archives. The validation images retain source-training storage paths, but they are excluded from regional fitting and from the deployed retrieval banks.</w:t>
       </w:r>
     </w:p>
     <w:tbl>
@@ -1626,7 +1355,7 @@
         <w:rPr>
           <w:b w:val="0"/>
         </w:rPr>
-        <w:t>The current inventory check found no missing coordinate pairs and no missing referenced image files in any of the three CSVs. Each subset contains unique image IDs and unique coordinate pairs, and the recorded split audit reports zero ID intersection between every pair of subsets. These checks establish record integrity; they do not establish that all images are visually distinct or that every GPS tag is correct. [7]</w:t>
+        <w:t>The current inventory check found no missing coordinate pairs and no missing referenced image files in any of the three CSVs. Each subset contains unique image IDs and unique coordinate pairs, and the recorded split audit reports zero ID intersection between every pair of subsets. Different image IDs do not rule out visually similar nearby views. [7]</w:t>
       </w:r>
     </w:p>
     <w:p>
@@ -1649,7 +1378,7 @@
         <w:rPr>
           <w:b w:val="0"/>
         </w:rPr>
-        <w:t>Both reference banks contain the 15,939 training entries only; held-out queries are excluded. Panoramax candidates were encoded separately but not deployed. Section 8 analyzes coverage and class frequency; Section 11 describes the additional-data experiment.</w:t>
+        <w:t>The ResNet neighbor bank and the combined ResNet-DINO reference bank each contain only the 15,939 training entries. Validation and test image IDs are excluded. [6, 7]</w:t>
       </w:r>
     </w:p>
     <w:p>
@@ -1749,7 +1478,7 @@
         <w:rPr>
           <w:b w:val="0"/>
         </w:rPr>
-        <w:t>Figure 1. Schematic processing diagram for the deployed fine retrieval path. The reference bank is prepared from training images; the query is encoded at inference. The figure represents computation, not geographic map geometry. Source: project implementation [6].</w:t>
+        <w:t>Figure 1. Schematic processing diagram for the deployed fine retrieval path. The reference bank is prepared from training images; the query is encoded at inference. Source: project implementation [6].</w:t>
       </w:r>
     </w:p>
     <w:p>
@@ -1783,7 +1512,7 @@
         <w:rPr>
           <w:b w:val="0"/>
         </w:rPr>
-        <w:t>The query's inference input is the processed image tensor. Uploaded GPS metadata, locality captions and file IDs do not determine the prediction. A known training reference contributes its stored coordinate or class only after visual matching. This distinction allows test-query IDs to remain outside the bank while still making use of labeled training examples.</w:t>
+        <w:t>Only the processed query image enters the encoders. The model does not use the upload's GPS metadata, filename or locality caption. Reference coordinates and class labels are retrieved after visual matching. [6]</w:t>
       </w:r>
     </w:p>
     <w:p>
@@ -1794,7 +1523,7 @@
         <w:rPr>
           <w:b w:val="0"/>
         </w:rPr>
-        <w:t>Fine retrieval removes one particular resolution restriction: its output is no longer limited to the 300 class centers. It does not become unrestricted coordinate regression. Its possible top-one outputs remain the bank's stored positions, and successful close localization depends on having an appropriate geographically nearby reference.</w:t>
+        <w:t>Fine retrieval can return any stored reference position instead of only 300 centers. Its precision still depends on reference coverage; it does not generate unrestricted coordinates.</w:t>
       </w:r>
     </w:p>
     <w:p>
@@ -1854,7 +1583,7 @@
         <w:rPr>
           <w:b w:val="0"/>
         </w:rPr>
-        <w:t>For query q and reference descriptors z_i, the search selects i_star = argmax_i cosine(z(q), z_i). The latitude and longitude of reference i_star become the result. The app displays cosine similarity as appearance similarity, not as the probability that a location is correct. It also shows the matched training image if its original file is locally available. The classifier head may be computed by shared regional code, but its winning class does not adjust the fine coordinate.</w:t>
+        <w:t>For query q and reference descriptors z_i, the search selects i_star = argmax_i cosine(z(q), z_i). The latitude and longitude of reference i_star become the result. The app displays cosine similarity as appearance similarity, not as the probability that a location is correct. It also shows the matched training image if its original file is locally available. The cell classifier does not adjust the fine-retrieval coordinate.</w:t>
       </w:r>
     </w:p>
     <w:p>
@@ -1905,563 +1634,6 @@
         <w:t>p_combined(j) = 0.8 p_classifier(j) + 0.2 v_neighbors(j).</w:t>
       </w:r>
     </w:p>
-    <w:tbl>
-      <w:tblPr>
-        <w:tblW w:type="auto" w:w="0"/>
-        <w:jc w:val="center"/>
-        <w:tblLayout w:type="fixed"/>
-        <w:tblLook w:firstColumn="1" w:firstRow="1" w:lastColumn="0" w:lastRow="0" w:noHBand="0" w:noVBand="1" w:val="04A0"/>
-      </w:tblPr>
-      <w:tblGrid>
-        <w:gridCol w:w="2256"/>
-        <w:gridCol w:w="2256"/>
-        <w:gridCol w:w="2256"/>
-        <w:gridCol w:w="2256"/>
-      </w:tblGrid>
-      <w:tr>
-        <w:trPr>
-          <w:cantSplit/>
-          <w:tblHeader/>
-        </w:trPr>
-        <w:tc>
-          <w:tcPr>
-            <w:tcW w:type="dxa" w:w="2256"/>
-            <w:vAlign w:val="center"/>
-            <w:tcMar>
-              <w:top w:w="90" w:type="dxa"/>
-              <w:bottom w:w="90" w:type="dxa"/>
-              <w:left w:w="100" w:type="dxa"/>
-              <w:right w:w="100" w:type="dxa"/>
-            </w:tcMar>
-            <w:shd w:fill="E7EBEF"/>
-            <w:tcBorders>
-              <w:top w:val="single" w:sz="4" w:color="D9D9D9"/>
-              <w:left w:val="single" w:sz="4" w:color="D9D9D9"/>
-              <w:bottom w:val="single" w:sz="4" w:color="D9D9D9"/>
-              <w:right w:val="single" w:sz="4" w:color="D9D9D9"/>
-            </w:tcBorders>
-          </w:tcPr>
-          <w:p>
-            <w:pPr>
-              <w:spacing w:after="0" w:line="259" w:lineRule="auto"/>
-              <w:jc w:val="left"/>
-            </w:pPr>
-            <w:r>
-              <w:rPr>
-                <w:b/>
-                <w:sz w:val="20"/>
-              </w:rPr>
-              <w:t>Cell in an illustrative example</w:t>
-            </w:r>
-          </w:p>
-        </w:tc>
-        <w:tc>
-          <w:tcPr>
-            <w:tcW w:type="dxa" w:w="2256"/>
-            <w:vAlign w:val="center"/>
-            <w:tcMar>
-              <w:top w:w="90" w:type="dxa"/>
-              <w:bottom w:w="90" w:type="dxa"/>
-              <w:left w:w="100" w:type="dxa"/>
-              <w:right w:w="100" w:type="dxa"/>
-            </w:tcMar>
-            <w:shd w:fill="E7EBEF"/>
-            <w:tcBorders>
-              <w:top w:val="single" w:sz="4" w:color="D9D9D9"/>
-              <w:left w:val="single" w:sz="4" w:color="D9D9D9"/>
-              <w:bottom w:val="single" w:sz="4" w:color="D9D9D9"/>
-              <w:right w:val="single" w:sz="4" w:color="D9D9D9"/>
-            </w:tcBorders>
-          </w:tcPr>
-          <w:p>
-            <w:pPr>
-              <w:spacing w:after="0" w:line="259" w:lineRule="auto"/>
-              <w:jc w:val="center"/>
-            </w:pPr>
-            <w:r>
-              <w:rPr>
-                <w:b/>
-                <w:sz w:val="20"/>
-              </w:rPr>
-              <w:t>Classifier</w:t>
-            </w:r>
-          </w:p>
-        </w:tc>
-        <w:tc>
-          <w:tcPr>
-            <w:tcW w:type="dxa" w:w="2256"/>
-            <w:vAlign w:val="center"/>
-            <w:tcMar>
-              <w:top w:w="90" w:type="dxa"/>
-              <w:bottom w:w="90" w:type="dxa"/>
-              <w:left w:w="100" w:type="dxa"/>
-              <w:right w:w="100" w:type="dxa"/>
-            </w:tcMar>
-            <w:shd w:fill="E7EBEF"/>
-            <w:tcBorders>
-              <w:top w:val="single" w:sz="4" w:color="D9D9D9"/>
-              <w:left w:val="single" w:sz="4" w:color="D9D9D9"/>
-              <w:bottom w:val="single" w:sz="4" w:color="D9D9D9"/>
-              <w:right w:val="single" w:sz="4" w:color="D9D9D9"/>
-            </w:tcBorders>
-          </w:tcPr>
-          <w:p>
-            <w:pPr>
-              <w:spacing w:after="0" w:line="259" w:lineRule="auto"/>
-              <w:jc w:val="center"/>
-            </w:pPr>
-            <w:r>
-              <w:rPr>
-                <w:b/>
-                <w:sz w:val="20"/>
-              </w:rPr>
-              <w:t>Neighbor votes</w:t>
-            </w:r>
-          </w:p>
-        </w:tc>
-        <w:tc>
-          <w:tcPr>
-            <w:tcW w:type="dxa" w:w="2256"/>
-            <w:vAlign w:val="center"/>
-            <w:tcMar>
-              <w:top w:w="90" w:type="dxa"/>
-              <w:bottom w:w="90" w:type="dxa"/>
-              <w:left w:w="100" w:type="dxa"/>
-              <w:right w:w="100" w:type="dxa"/>
-            </w:tcMar>
-            <w:shd w:fill="E7EBEF"/>
-            <w:tcBorders>
-              <w:top w:val="single" w:sz="4" w:color="D9D9D9"/>
-              <w:left w:val="single" w:sz="4" w:color="D9D9D9"/>
-              <w:bottom w:val="single" w:sz="4" w:color="D9D9D9"/>
-              <w:right w:val="single" w:sz="4" w:color="D9D9D9"/>
-            </w:tcBorders>
-          </w:tcPr>
-          <w:p>
-            <w:pPr>
-              <w:spacing w:after="0" w:line="259" w:lineRule="auto"/>
-              <w:jc w:val="center"/>
-            </w:pPr>
-            <w:r>
-              <w:rPr>
-                <w:b/>
-                <w:sz w:val="20"/>
-              </w:rPr>
-              <w:t>Combined</w:t>
-            </w:r>
-          </w:p>
-        </w:tc>
-      </w:tr>
-      <w:tr>
-        <w:trPr>
-          <w:cantSplit/>
-        </w:trPr>
-        <w:tc>
-          <w:tcPr>
-            <w:tcW w:type="dxa" w:w="2256"/>
-            <w:vAlign w:val="center"/>
-            <w:tcMar>
-              <w:top w:w="90" w:type="dxa"/>
-              <w:bottom w:w="90" w:type="dxa"/>
-              <w:left w:w="100" w:type="dxa"/>
-              <w:right w:w="100" w:type="dxa"/>
-            </w:tcMar>
-            <w:shd w:fill="FFFFFF"/>
-            <w:tcBorders>
-              <w:top w:val="single" w:sz="4" w:color="D9D9D9"/>
-              <w:left w:val="single" w:sz="4" w:color="D9D9D9"/>
-              <w:bottom w:val="single" w:sz="4" w:color="D9D9D9"/>
-              <w:right w:val="single" w:sz="4" w:color="D9D9D9"/>
-            </w:tcBorders>
-          </w:tcPr>
-          <w:p>
-            <w:pPr>
-              <w:spacing w:after="0" w:line="259" w:lineRule="auto"/>
-              <w:jc w:val="left"/>
-            </w:pPr>
-            <w:r>
-              <w:rPr>
-                <w:b w:val="0"/>
-                <w:sz w:val="20"/>
-              </w:rPr>
-              <w:t>A</w:t>
-            </w:r>
-          </w:p>
-        </w:tc>
-        <w:tc>
-          <w:tcPr>
-            <w:tcW w:type="dxa" w:w="2256"/>
-            <w:vAlign w:val="center"/>
-            <w:tcMar>
-              <w:top w:w="90" w:type="dxa"/>
-              <w:bottom w:w="90" w:type="dxa"/>
-              <w:left w:w="100" w:type="dxa"/>
-              <w:right w:w="100" w:type="dxa"/>
-            </w:tcMar>
-            <w:shd w:fill="FFFFFF"/>
-            <w:tcBorders>
-              <w:top w:val="single" w:sz="4" w:color="D9D9D9"/>
-              <w:left w:val="single" w:sz="4" w:color="D9D9D9"/>
-              <w:bottom w:val="single" w:sz="4" w:color="D9D9D9"/>
-              <w:right w:val="single" w:sz="4" w:color="D9D9D9"/>
-            </w:tcBorders>
-          </w:tcPr>
-          <w:p>
-            <w:pPr>
-              <w:spacing w:after="0" w:line="259" w:lineRule="auto"/>
-              <w:jc w:val="center"/>
-            </w:pPr>
-            <w:r>
-              <w:rPr>
-                <w:b w:val="0"/>
-                <w:sz w:val="20"/>
-              </w:rPr>
-              <w:t>0.48</w:t>
-            </w:r>
-          </w:p>
-        </w:tc>
-        <w:tc>
-          <w:tcPr>
-            <w:tcW w:type="dxa" w:w="2256"/>
-            <w:vAlign w:val="center"/>
-            <w:tcMar>
-              <w:top w:w="90" w:type="dxa"/>
-              <w:bottom w:w="90" w:type="dxa"/>
-              <w:left w:w="100" w:type="dxa"/>
-              <w:right w:w="100" w:type="dxa"/>
-            </w:tcMar>
-            <w:shd w:fill="FFFFFF"/>
-            <w:tcBorders>
-              <w:top w:val="single" w:sz="4" w:color="D9D9D9"/>
-              <w:left w:val="single" w:sz="4" w:color="D9D9D9"/>
-              <w:bottom w:val="single" w:sz="4" w:color="D9D9D9"/>
-              <w:right w:val="single" w:sz="4" w:color="D9D9D9"/>
-            </w:tcBorders>
-          </w:tcPr>
-          <w:p>
-            <w:pPr>
-              <w:spacing w:after="0" w:line="259" w:lineRule="auto"/>
-              <w:jc w:val="center"/>
-            </w:pPr>
-            <w:r>
-              <w:rPr>
-                <w:b w:val="0"/>
-                <w:sz w:val="20"/>
-              </w:rPr>
-              <w:t>0.20</w:t>
-            </w:r>
-          </w:p>
-        </w:tc>
-        <w:tc>
-          <w:tcPr>
-            <w:tcW w:type="dxa" w:w="2256"/>
-            <w:vAlign w:val="center"/>
-            <w:tcMar>
-              <w:top w:w="90" w:type="dxa"/>
-              <w:bottom w:w="90" w:type="dxa"/>
-              <w:left w:w="100" w:type="dxa"/>
-              <w:right w:w="100" w:type="dxa"/>
-            </w:tcMar>
-            <w:shd w:fill="FFFFFF"/>
-            <w:tcBorders>
-              <w:top w:val="single" w:sz="4" w:color="D9D9D9"/>
-              <w:left w:val="single" w:sz="4" w:color="D9D9D9"/>
-              <w:bottom w:val="single" w:sz="4" w:color="D9D9D9"/>
-              <w:right w:val="single" w:sz="4" w:color="D9D9D9"/>
-            </w:tcBorders>
-          </w:tcPr>
-          <w:p>
-            <w:pPr>
-              <w:spacing w:after="0" w:line="259" w:lineRule="auto"/>
-              <w:jc w:val="center"/>
-            </w:pPr>
-            <w:r>
-              <w:rPr>
-                <w:b w:val="0"/>
-                <w:sz w:val="20"/>
-              </w:rPr>
-              <w:t>0.424</w:t>
-            </w:r>
-          </w:p>
-        </w:tc>
-      </w:tr>
-      <w:tr>
-        <w:trPr>
-          <w:cantSplit/>
-        </w:trPr>
-        <w:tc>
-          <w:tcPr>
-            <w:tcW w:type="dxa" w:w="2256"/>
-            <w:vAlign w:val="center"/>
-            <w:tcMar>
-              <w:top w:w="90" w:type="dxa"/>
-              <w:bottom w:w="90" w:type="dxa"/>
-              <w:left w:w="100" w:type="dxa"/>
-              <w:right w:w="100" w:type="dxa"/>
-            </w:tcMar>
-            <w:shd w:fill="F6F7F8"/>
-            <w:tcBorders>
-              <w:top w:val="single" w:sz="4" w:color="D9D9D9"/>
-              <w:left w:val="single" w:sz="4" w:color="D9D9D9"/>
-              <w:bottom w:val="single" w:sz="4" w:color="D9D9D9"/>
-              <w:right w:val="single" w:sz="4" w:color="D9D9D9"/>
-            </w:tcBorders>
-          </w:tcPr>
-          <w:p>
-            <w:pPr>
-              <w:spacing w:after="0" w:line="259" w:lineRule="auto"/>
-              <w:jc w:val="left"/>
-            </w:pPr>
-            <w:r>
-              <w:rPr>
-                <w:b w:val="0"/>
-                <w:sz w:val="20"/>
-              </w:rPr>
-              <w:t>B</w:t>
-            </w:r>
-          </w:p>
-        </w:tc>
-        <w:tc>
-          <w:tcPr>
-            <w:tcW w:type="dxa" w:w="2256"/>
-            <w:vAlign w:val="center"/>
-            <w:tcMar>
-              <w:top w:w="90" w:type="dxa"/>
-              <w:bottom w:w="90" w:type="dxa"/>
-              <w:left w:w="100" w:type="dxa"/>
-              <w:right w:w="100" w:type="dxa"/>
-            </w:tcMar>
-            <w:shd w:fill="F6F7F8"/>
-            <w:tcBorders>
-              <w:top w:val="single" w:sz="4" w:color="D9D9D9"/>
-              <w:left w:val="single" w:sz="4" w:color="D9D9D9"/>
-              <w:bottom w:val="single" w:sz="4" w:color="D9D9D9"/>
-              <w:right w:val="single" w:sz="4" w:color="D9D9D9"/>
-            </w:tcBorders>
-          </w:tcPr>
-          <w:p>
-            <w:pPr>
-              <w:spacing w:after="0" w:line="259" w:lineRule="auto"/>
-              <w:jc w:val="center"/>
-            </w:pPr>
-            <w:r>
-              <w:rPr>
-                <w:b w:val="0"/>
-                <w:sz w:val="20"/>
-              </w:rPr>
-              <w:t>0.45</w:t>
-            </w:r>
-          </w:p>
-        </w:tc>
-        <w:tc>
-          <w:tcPr>
-            <w:tcW w:type="dxa" w:w="2256"/>
-            <w:vAlign w:val="center"/>
-            <w:tcMar>
-              <w:top w:w="90" w:type="dxa"/>
-              <w:bottom w:w="90" w:type="dxa"/>
-              <w:left w:w="100" w:type="dxa"/>
-              <w:right w:w="100" w:type="dxa"/>
-            </w:tcMar>
-            <w:shd w:fill="F6F7F8"/>
-            <w:tcBorders>
-              <w:top w:val="single" w:sz="4" w:color="D9D9D9"/>
-              <w:left w:val="single" w:sz="4" w:color="D9D9D9"/>
-              <w:bottom w:val="single" w:sz="4" w:color="D9D9D9"/>
-              <w:right w:val="single" w:sz="4" w:color="D9D9D9"/>
-            </w:tcBorders>
-          </w:tcPr>
-          <w:p>
-            <w:pPr>
-              <w:spacing w:after="0" w:line="259" w:lineRule="auto"/>
-              <w:jc w:val="center"/>
-            </w:pPr>
-            <w:r>
-              <w:rPr>
-                <w:b w:val="0"/>
-                <w:sz w:val="20"/>
-              </w:rPr>
-              <w:t>0.70</w:t>
-            </w:r>
-          </w:p>
-        </w:tc>
-        <w:tc>
-          <w:tcPr>
-            <w:tcW w:type="dxa" w:w="2256"/>
-            <w:vAlign w:val="center"/>
-            <w:tcMar>
-              <w:top w:w="90" w:type="dxa"/>
-              <w:bottom w:w="90" w:type="dxa"/>
-              <w:left w:w="100" w:type="dxa"/>
-              <w:right w:w="100" w:type="dxa"/>
-            </w:tcMar>
-            <w:shd w:fill="F6F7F8"/>
-            <w:tcBorders>
-              <w:top w:val="single" w:sz="4" w:color="D9D9D9"/>
-              <w:left w:val="single" w:sz="4" w:color="D9D9D9"/>
-              <w:bottom w:val="single" w:sz="4" w:color="D9D9D9"/>
-              <w:right w:val="single" w:sz="4" w:color="D9D9D9"/>
-            </w:tcBorders>
-          </w:tcPr>
-          <w:p>
-            <w:pPr>
-              <w:spacing w:after="0" w:line="259" w:lineRule="auto"/>
-              <w:jc w:val="center"/>
-            </w:pPr>
-            <w:r>
-              <w:rPr>
-                <w:b w:val="0"/>
-                <w:sz w:val="20"/>
-              </w:rPr>
-              <w:t>0.500</w:t>
-            </w:r>
-          </w:p>
-        </w:tc>
-      </w:tr>
-      <w:tr>
-        <w:trPr>
-          <w:cantSplit/>
-        </w:trPr>
-        <w:tc>
-          <w:tcPr>
-            <w:tcW w:type="dxa" w:w="2256"/>
-            <w:vAlign w:val="center"/>
-            <w:tcMar>
-              <w:top w:w="90" w:type="dxa"/>
-              <w:bottom w:w="90" w:type="dxa"/>
-              <w:left w:w="100" w:type="dxa"/>
-              <w:right w:w="100" w:type="dxa"/>
-            </w:tcMar>
-            <w:shd w:fill="FFFFFF"/>
-            <w:tcBorders>
-              <w:top w:val="single" w:sz="4" w:color="D9D9D9"/>
-              <w:left w:val="single" w:sz="4" w:color="D9D9D9"/>
-              <w:bottom w:val="single" w:sz="4" w:color="D9D9D9"/>
-              <w:right w:val="single" w:sz="4" w:color="D9D9D9"/>
-            </w:tcBorders>
-          </w:tcPr>
-          <w:p>
-            <w:pPr>
-              <w:spacing w:after="0" w:line="259" w:lineRule="auto"/>
-              <w:jc w:val="left"/>
-            </w:pPr>
-            <w:r>
-              <w:rPr>
-                <w:b w:val="0"/>
-                <w:sz w:val="20"/>
-              </w:rPr>
-              <w:t>C</w:t>
-            </w:r>
-          </w:p>
-        </w:tc>
-        <w:tc>
-          <w:tcPr>
-            <w:tcW w:type="dxa" w:w="2256"/>
-            <w:vAlign w:val="center"/>
-            <w:tcMar>
-              <w:top w:w="90" w:type="dxa"/>
-              <w:bottom w:w="90" w:type="dxa"/>
-              <w:left w:w="100" w:type="dxa"/>
-              <w:right w:w="100" w:type="dxa"/>
-            </w:tcMar>
-            <w:shd w:fill="FFFFFF"/>
-            <w:tcBorders>
-              <w:top w:val="single" w:sz="4" w:color="D9D9D9"/>
-              <w:left w:val="single" w:sz="4" w:color="D9D9D9"/>
-              <w:bottom w:val="single" w:sz="4" w:color="D9D9D9"/>
-              <w:right w:val="single" w:sz="4" w:color="D9D9D9"/>
-            </w:tcBorders>
-          </w:tcPr>
-          <w:p>
-            <w:pPr>
-              <w:spacing w:after="0" w:line="259" w:lineRule="auto"/>
-              <w:jc w:val="center"/>
-            </w:pPr>
-            <w:r>
-              <w:rPr>
-                <w:b w:val="0"/>
-                <w:sz w:val="20"/>
-              </w:rPr>
-              <w:t>0.07</w:t>
-            </w:r>
-          </w:p>
-        </w:tc>
-        <w:tc>
-          <w:tcPr>
-            <w:tcW w:type="dxa" w:w="2256"/>
-            <w:vAlign w:val="center"/>
-            <w:tcMar>
-              <w:top w:w="90" w:type="dxa"/>
-              <w:bottom w:w="90" w:type="dxa"/>
-              <w:left w:w="100" w:type="dxa"/>
-              <w:right w:w="100" w:type="dxa"/>
-            </w:tcMar>
-            <w:shd w:fill="FFFFFF"/>
-            <w:tcBorders>
-              <w:top w:val="single" w:sz="4" w:color="D9D9D9"/>
-              <w:left w:val="single" w:sz="4" w:color="D9D9D9"/>
-              <w:bottom w:val="single" w:sz="4" w:color="D9D9D9"/>
-              <w:right w:val="single" w:sz="4" w:color="D9D9D9"/>
-            </w:tcBorders>
-          </w:tcPr>
-          <w:p>
-            <w:pPr>
-              <w:spacing w:after="0" w:line="259" w:lineRule="auto"/>
-              <w:jc w:val="center"/>
-            </w:pPr>
-            <w:r>
-              <w:rPr>
-                <w:b w:val="0"/>
-                <w:sz w:val="20"/>
-              </w:rPr>
-              <w:t>0.10</w:t>
-            </w:r>
-          </w:p>
-        </w:tc>
-        <w:tc>
-          <w:tcPr>
-            <w:tcW w:type="dxa" w:w="2256"/>
-            <w:vAlign w:val="center"/>
-            <w:tcMar>
-              <w:top w:w="90" w:type="dxa"/>
-              <w:bottom w:w="90" w:type="dxa"/>
-              <w:left w:w="100" w:type="dxa"/>
-              <w:right w:w="100" w:type="dxa"/>
-            </w:tcMar>
-            <w:shd w:fill="FFFFFF"/>
-            <w:tcBorders>
-              <w:top w:val="single" w:sz="4" w:color="D9D9D9"/>
-              <w:left w:val="single" w:sz="4" w:color="D9D9D9"/>
-              <w:bottom w:val="single" w:sz="4" w:color="D9D9D9"/>
-              <w:right w:val="single" w:sz="4" w:color="D9D9D9"/>
-            </w:tcBorders>
-          </w:tcPr>
-          <w:p>
-            <w:pPr>
-              <w:spacing w:after="0" w:line="259" w:lineRule="auto"/>
-              <w:jc w:val="center"/>
-            </w:pPr>
-            <w:r>
-              <w:rPr>
-                <w:b w:val="0"/>
-                <w:sz w:val="20"/>
-              </w:rPr>
-              <w:t>0.076</w:t>
-            </w:r>
-          </w:p>
-        </w:tc>
-      </w:tr>
-    </w:tbl>
-    <w:p>
-      <w:pPr>
-        <w:spacing w:after="60" w:line="60" w:lineRule="exact"/>
-      </w:pPr>
-      <w:r>
-        <w:rPr>
-          <w:sz w:val="6"/>
-        </w:rPr>
-      </w:r>
-    </w:p>
     <w:p>
       <w:pPr>
         <w:widowControl/>
@@ -2470,7 +1642,7 @@
         <w:rPr>
           <w:b w:val="0"/>
         </w:rPr>
-        <w:t>Table 2. Illustrative class-score blend, not an observed project query. Classifier-only chooses A; the blended method chooses B. The returned coordinate changes to B's center, rather than becoming an average of reference GPS positions. If both evidence sources prefer the same cell, the KNN option may leave the marker unchanged. [6]</w:t>
+        <w:t>The highest blended score determines the returned cell center. KNN votes can change the selected cell; they do not average GPS coordinates. If both methods favor the same cell, the returned coordinate stays unchanged. [6]</w:t>
       </w:r>
     </w:p>
     <w:p>
@@ -2528,7 +1700,7 @@
         <w:rPr>
           <w:b w:val="0"/>
         </w:rPr>
-        <w:t>The general model-training transform supports random resized crops with scale 0.8-1.0 and horizontal flips with probability 0.5. These augmentations expose the classifier to altered appearances. The later frozen-feature head fitting and bank extraction use the deterministic view pipeline instead. This difference in view preparation is relevant when interpreting comparisons between trained checkpoints.</w:t>
+        <w:t>The installed frozen-feature head fitting and reference extraction use deterministic preprocessing. The repository also provides random crops and horizontal flips for encoder training; these are not applied during inference. [6]</w:t>
       </w:r>
     </w:p>
     <w:p>
@@ -2562,7 +1734,7 @@
         <w:rPr>
           <w:b w:val="0"/>
         </w:rPr>
-        <w:t>The installed regional head uses geographic label smoothing. The target is 90% hard assigned class plus 10% of a geographic distribution whose mass decreases with haversine distance from the training GPS to cell centers, using a 15-km scale. This soft target reduces an abrupt all-or-nothing penalty near geographic boundaries. Only training coordinates are used to construct these fitting targets. [7]</w:t>
+        <w:t>The installed regional head uses geographic label smoothing. The target is 90% hard assigned class plus 10% of a geographic distribution whose mass decreases with haversine distance from the training GPS to cell centers, using a 15-km scale. This soft target reduces an abrupt all-or-nothing penalty near geographic boundaries. Only training coordinates are used to construct these fitting targets. [6, 7]</w:t>
       </w:r>
     </w:p>
     <w:p>
@@ -2585,7 +1757,7 @@
         <w:rPr>
           <w:b w:val="0"/>
         </w:rPr>
-        <w:t>Reference descriptors are computed once while encoders are frozen. The compact fine bank stores its 2,432-dimensional descriptors in FP16; runtime converts them to FP32 and renormalizes for search. A separate deployment check verified the compressed bank's reported official-test threshold counts and median.</w:t>
+        <w:t>Reference descriptors are computed once while encoders are frozen. The compact fine bank stores its 2,432-dimensional descriptors in FP16; runtime converts them to FP32 and renormalizes for search. Compression was checked to preserve the reported test threshold counts and median. [7]</w:t>
       </w:r>
     </w:p>
     <w:p>
@@ -2596,7 +1768,7 @@
         <w:rPr>
           <w:b w:val="0"/>
         </w:rPr>
-        <w:t>Model fingerprints are checked so a bank is not accidentally paired with a different ResNet or DINO checkpoint. These identity checks protect reproducibility, not predictive correctness. Neither missing-GPS record checks nor fingerprint validation proves that an uploaded image has a uniquely localizable appearance.</w:t>
+        <w:t>Checkpoint hashes ensure that each reference bank is paired with the encoder weights used to create it. [6]</w:t>
       </w:r>
     </w:p>
     <w:p>
@@ -2632,7 +1804,7 @@
         <w:rPr>
           <w:b w:val="0"/>
         </w:rPr>
-        <w:t>We inspected coordinates before interpreting model scores. The training positions span latitudes 8.18284-12.79964 and longitudes 74.90226-77.49984. The official test positions span 8.12432-12.67493 and 75.06518-77.49543. No missing coordinates were found. These ranges describe the recovered regional subset, not the complete OSV-5M release.</w:t>
+        <w:t>We inspected coordinates before interpreting model scores. The training positions span latitudes 8.18284-12.79964 and longitudes 74.90226-77.49984. The official test positions span 8.12432-12.67493 and 75.06518-77.49543. These ranges describe the regional subset.</w:t>
       </w:r>
     </w:p>
     <w:p>
@@ -2685,7 +1857,7 @@
         <w:rPr>
           <w:b w:val="0"/>
         </w:rPr>
-        <w:t>Figure 2. Actual training and official test positions from the regional CSVs. Each panel uses the same coordinate limits; all positions are plotted. This is a latitude-longitude scatter plot with no administrative boundary, not a map proving Kerala membership. Source: regional CSV inventory [7].</w:t>
+        <w:t>Figure 2. Actual training and official test positions from the regional CSVs. Both panels use the same coordinate limits. No administrative boundary is shown. Source: regional CSV inventory [7].</w:t>
       </w:r>
     </w:p>
     <w:p>
@@ -2707,7 +1879,7 @@
         <w:rPr>
           <w:b w:val="0"/>
         </w:rPr>
-        <w:t>The test subset is smaller and follows a harder separation policy than the random validation holdout. Visual inspection of coordinate coverage alone cannot establish viewpoint overlap or GPS quality, but it exposes why a location-based method may perform differently across parts of the region.</w:t>
+        <w:t>The official test has greater separation from training locations than random validation, as quantified in Table 2.</w:t>
       </w:r>
     </w:p>
     <w:p>
@@ -2730,7 +1902,7 @@
         <w:rPr>
           <w:b w:val="0"/>
         </w:rPr>
-        <w:t>Top-one retrieval can only return a reference position. If the closest reference coordinate to a query is several kilometers away, an appearance model cannot return a sub-kilometer position through that lookup alone. Classification additionally incurs the distance between an image's true position and the chosen class center. The map and the retrieval bank therefore impose different geometric resolution limits even before appearance errors are considered.</w:t>
+        <w:t>Top-one retrieval can only return a reference position. If the closest reference coordinate to a query is several kilometers away, an appearance model cannot return a sub-kilometer position through that lookup alone. Classification additionally incurs the distance between an image's true position and the chosen class center. The cell centers and reference positions impose different resolution limits before visual matching errors are considered.</w:t>
       </w:r>
     </w:p>
     <w:p>
@@ -2818,7 +1990,7 @@
         <w:rPr>
           <w:b w:val="0"/>
         </w:rPr>
-        <w:t>These counts make class balance a relevant modeling issue. Sparse classes offer fewer examples of viewpoint and appearance variation, while repeated views from frequently captured areas can dominate nearest-neighbor evidence. The count distribution does not by itself establish a causal explanation for any particular failure, but it argues against treating aggregate accuracy as uniform across the region.</w:t>
+        <w:t>These counts make class balance a relevant modeling issue. Sparse classes offer fewer examples of viewpoint and appearance variation, while repeated views from frequently captured areas can dominate nearest-neighbor evidence. Aggregate accuracy therefore need not represent every locality equally well.</w:t>
       </w:r>
     </w:p>
     <w:p>
@@ -3370,7 +2542,7 @@
         <w:rPr>
           <w:b w:val="0"/>
         </w:rPr>
-        <w:t>Table 3. Recorded spatial audit of the recovered regional subset [7]. Zero image-ID overlap does not imply geographic independence. The 982 nearby validation queries help explain why validation is substantially easier. None of the official test locations is within 1 km of the original reference bank, creating a hard coverage limit for a method restricted to returning reference positions.</w:t>
+        <w:t>Table 2. Recorded spatial audit of the recovered regional subset [7]. Zero image-ID overlap does not imply geographic independence. The 982 nearby validation queries help explain why validation is substantially easier. None of the official test locations is within 1 km of the original reference bank, creating a hard coverage limit for a method restricted to returning reference positions.</w:t>
       </w:r>
     </w:p>
     <w:p>
@@ -3417,7 +2589,7 @@
         <w:rPr>
           <w:b w:val="0"/>
         </w:rPr>
-        <w:t>The installed head was fitted with the backbone frozen. Geographic smoothing uses AdamW with learning rate 0.0001, weight decay 0.01, batch size 256 and 12 epochs per recipe. Gradients update the head during fitting, while the cached backbone features stay fixed. These settings describe head fitting, not a new end-to-end training of the entire fine retrieval ensemble.</w:t>
+        <w:t>The installed geographic head was fitted on frozen backbone features using AdamW, a learning rate of 0.0001, weight decay 0.01, batch size 256 and 12 epochs per recipe. Only the head weights are updated in this fitting stage. [6, 7]</w:t>
       </w:r>
     </w:p>
     <w:p>
@@ -3497,7 +2669,7 @@
         <w:rPr>
           <w:b w:val="0"/>
         </w:rPr>
-        <w:t>The recorded experiments used an NVIDIA RTX 3050 Laptop GPU with 6 GB memory and PyTorch 2.7.1 plus CUDA 12.8. The local launcher selects a working GPU environment or falls back to CPU. No Kaggle training run or aerial-ground encoder is part of the deployed method.</w:t>
+        <w:t>Experiments used an NVIDIA RTX 3050 Laptop GPU with 6 GB memory and PyTorch 2.7.1 with CUDA 12.8. [7]</w:t>
       </w:r>
     </w:p>
     <w:p>
@@ -4124,7 +3296,7 @@
         <w:rPr>
           <w:b w:val="0"/>
         </w:rPr>
-        <w:t>Table 4. Recorded results for the currently available regional options on the reused official test subset. The fine column describes the deployed compact bank; classifier results refer to the installed regularized head. No metric in this table is a correctness probability for an individual upload. [7]</w:t>
+        <w:t>Table 3. Recorded results for the currently available regional options on the reused official test subset. The retrieval row uses the deployed compact bank; the classifier rows use the installed regularized head. [7]</w:t>
       </w:r>
     </w:p>
     <w:p>
@@ -4135,7 +3307,7 @@
         <w:rPr>
           <w:b w:val="0"/>
         </w:rPr>
-        <w:t>Adding class votes improves aggregate within-25-km success by 5.88 percentage points relative to classifier-only. Fine retrieval improves that measure by a further 9.52 points and reduces median error by approximately 27.1% relative to the class-voting option. The comparisons combine different output rules and, for fine mode, a second encoder; they do not isolate a single causal factor.</w:t>
+        <w:t>Adding class votes improves aggregate within-25-km success by 5.88 percentage points relative to classifier-only. Fine retrieval adds a further 9.52 percentage points. This comparison changes both the representation and output rule, so it does not isolate the effect of a single component.</w:t>
       </w:r>
     </w:p>
     <w:p>
@@ -4169,129 +3341,7 @@
         <w:rPr>
           <w:b w:val="0"/>
         </w:rPr>
-        <w:t>These are exploratory follow-ups on an official benchmark already inspected during project development. They are not independent confirmation on a fresh test. We do not claim statistical significance, multiple-seed robustness or performance uniformity across localities. The demonstration photographs were selected from official test archives and are not an unbiased sample of expected performance.</w:t>
-      </w:r>
-    </w:p>
-    <w:p>
-      <w:pPr>
-        <w:pStyle w:val="Heading2"/>
-        <w:pageBreakBefore/>
-        <w:widowControl/>
-      </w:pPr>
-      <w:r>
-        <w:rPr>
-          <w:b w:val="0"/>
-        </w:rPr>
-        <w:t>Error distribution and reference coverage</w:t>
-      </w:r>
-    </w:p>
-    <w:p>
-      <w:pPr>
-        <w:keepNext/>
-        <w:spacing w:after="60"/>
-        <w:jc w:val="center"/>
-      </w:pPr>
-      <w:r>
-        <w:drawing>
-          <wp:inline xmlns:a="http://schemas.openxmlformats.org/drawingml/2006/main" xmlns:pic="http://schemas.openxmlformats.org/drawingml/2006/picture">
-            <wp:extent cx="5669280" cy="2886179"/>
-            <wp:docPr id="4" name="Picture 4" descr="Figure 4 Fine retrieval error distribution"/>
-            <wp:cNvGraphicFramePr>
-              <a:graphicFrameLocks noChangeAspect="1"/>
-            </wp:cNvGraphicFramePr>
-            <a:graphic>
-              <a:graphicData uri="http://schemas.openxmlformats.org/drawingml/2006/picture">
-                <pic:pic>
-                  <pic:nvPicPr>
-                    <pic:cNvPr id="0" name="error_cdf.png"/>
-                    <pic:cNvPicPr/>
-                  </pic:nvPicPr>
-                  <pic:blipFill>
-                    <a:blip r:embed="rId13"/>
-                    <a:stretch>
-                      <a:fillRect/>
-                    </a:stretch>
-                  </pic:blipFill>
-                  <pic:spPr>
-                    <a:xfrm>
-                      <a:off x="0" y="0"/>
-                      <a:ext cx="5669280" cy="2886179"/>
-                    </a:xfrm>
-                    <a:prstGeom prst="rect"/>
-                  </pic:spPr>
-                </pic:pic>
-              </a:graphicData>
-            </a:graphic>
-          </wp:inline>
-        </w:drawing>
-      </w:r>
-    </w:p>
-    <w:p>
-      <w:pPr>
-        <w:pStyle w:val="Caption"/>
-        <w:widowControl/>
-      </w:pPr>
-      <w:r>
-        <w:rPr>
-          <w:b w:val="0"/>
-        </w:rPr>
-        <w:t>Figure 4. Empirical cumulative distribution of 357 deployed fine-retrieval test errors. The horizontal axis is logarithmic. Markers show the observed within-5-km, within-25-km and within-200-km fractions, not calibrated probabilities for future images. Source: compact deployment per-query predictions [7].</w:t>
-      </w:r>
-    </w:p>
-    <w:p>
-      <w:pPr>
-        <w:widowControl/>
-      </w:pPr>
-      <w:r>
-        <w:rPr>
-          <w:b w:val="0"/>
-        </w:rPr>
-        <w:t>None of the fine outputs is within 1 km of the official test position. This is consistent with the spatial audit: every official test position is more than 1 km from every reference position in the original bank. A method whose output is one of those positions cannot beat that geometric lower bound, regardless of descriptor quality. This does not mean the same bound applies to the cell methods, whose centers can lie between training positions.</w:t>
-      </w:r>
-    </w:p>
-    <w:p>
-      <w:pPr>
-        <w:widowControl/>
-      </w:pPr>
-      <w:r>
-        <w:rPr>
-          <w:b w:val="0"/>
-        </w:rPr>
-        <w:t>Random validation gives 71.1% within 5 km and a 1.072-km median for the compact fine method. Those larger figures must be read together with the 982 validation locations lying within 1 km of training. They do not demonstrate equally strong localization of new geographic areas.</w:t>
-      </w:r>
-    </w:p>
-    <w:p>
-      <w:pPr>
-        <w:pStyle w:val="Heading2"/>
-        <w:widowControl/>
-      </w:pPr>
-      <w:r>
-        <w:rPr>
-          <w:b w:val="0"/>
-        </w:rPr>
-        <w:t>Qualitative behavior and deployment checks</w:t>
-      </w:r>
-    </w:p>
-    <w:p>
-      <w:pPr>
-        <w:widowControl/>
-      </w:pPr>
-      <w:r>
-        <w:rPr>
-          <w:b w:val="0"/>
-        </w:rPr>
-        <w:t>A curated Kottayam query, image 1083931132408866, retrieves training reference 309630957741047 near 9.67611, 76.42105 in the checked run. The cosine score is approximately 0.812. This example demonstrates the query-to-reference path but does not establish overall accuracy. Another gallery query labeled Southern Kerala retrieves a northern reference near 12.45793, 75.09220, illustrating a real distant error.</w:t>
-      </w:r>
-    </w:p>
-    <w:p>
-      <w:pPr>
-        <w:widowControl/>
-      </w:pPr>
-      <w:r>
-        <w:rPr>
-          <w:b w:val="0"/>
-        </w:rPr>
-        <w:t>The compact deployment bank was checked against the selected feature recipe, and installed model fingerprints were verified. A software suite of 91 tests passed after the prototype experiment was added. These are software checks rather than localization benchmark samples. The map and reference display improve inspectability: they show what was returned and where it came from, without proving that the matched scene is geographically correct.</w:t>
+        <w:t>The official subset was reused during project development; these comparisons are exploratory rather than fresh independent confirmation. Random validation gives 71.1% within 5 km and a 1.072-km median, but 982 validation positions are within 1 km of training. Demonstration images are selected test examples, not an unbiased performance sample. [7]</w:t>
       </w:r>
     </w:p>
     <w:p>
@@ -4327,7 +3377,7 @@
         <w:rPr>
           <w:b w:val="0"/>
         </w:rPr>
-        <w:t>PlaNet formulates image geolocation as classification over geographic cells. It establishes that location-sensitive visual evidence can be learned from image pixels, but the discretization of the output affects spatial precision. Our 300-cell classifier follows that broad formulation at a much smaller regional scale and with a different architecture and dataset. We do not reproduce PlaNet's training setup or compare its headline accuracy directly. [4]</w:t>
+        <w:t>PlaNet treats image geolocation as classification over geographic cells. Our 300-cell ResNet classifier uses the same broad formulation at a regional scale, with different data and architecture. Classification can infer a cell from learned visual cues, but returning one center per class limits spatial resolution. [4]</w:t>
       </w:r>
     </w:p>
     <w:p>
@@ -4338,7 +3388,7 @@
         <w:rPr>
           <w:b w:val="0"/>
         </w:rPr>
-        <w:t>Reference-image retrieval avoids committing every image in a class to one center. Our combined descriptors select an individual reference position, improving observed regional error relative to the current cell options. However, this approach trades the coarse-center restriction for dependence on reference density and visual overlap. It remains a discrete lookup over available reference coordinates.</w:t>
+        <w:t>Our default retrieval method returns the position of an individual training reference. It has more possible outputs than the classifier and lower measured regional error, but cannot return a location absent from its reference bank.</w:t>
       </w:r>
     </w:p>
     <w:p>
@@ -4349,559 +3399,30 @@
         <w:rPr>
           <w:b w:val="0"/>
         </w:rPr>
-        <w:t>The ETH Zurich and Google method combines learned ground-view prototypes with aerial-image embeddings and fine S2 geographic codes. Our deployed model has no aerial encoder or jointly trained ground-aerial representation. Their reported result of more than 68% within 200 m on a European evaluation is therefore neither reproduced nor directly comparable to our within-25-km regional result. The research suggests a useful route toward denser geographic representations, but requires data and training components absent from this deployment. [5]</w:t>
-      </w:r>
-    </w:p>
-    <w:tbl>
-      <w:tblPr>
-        <w:tblW w:type="auto" w:w="0"/>
-        <w:jc w:val="center"/>
-        <w:tblLayout w:type="fixed"/>
-        <w:tblLook w:firstColumn="1" w:firstRow="1" w:lastColumn="0" w:lastRow="0" w:noHBand="0" w:noVBand="1" w:val="04A0"/>
-      </w:tblPr>
-      <w:tblGrid>
-        <w:gridCol w:w="3024"/>
-        <w:gridCol w:w="2304"/>
-        <w:gridCol w:w="3697"/>
-      </w:tblGrid>
-      <w:tr>
-        <w:trPr>
-          <w:cantSplit/>
-          <w:tblHeader/>
-        </w:trPr>
-        <w:tc>
-          <w:tcPr>
-            <w:tcW w:type="dxa" w:w="3024"/>
-            <w:vAlign w:val="center"/>
-            <w:tcMar>
-              <w:top w:w="90" w:type="dxa"/>
-              <w:bottom w:w="90" w:type="dxa"/>
-              <w:left w:w="100" w:type="dxa"/>
-              <w:right w:w="100" w:type="dxa"/>
-            </w:tcMar>
-            <w:shd w:fill="E7EBEF"/>
-            <w:tcBorders>
-              <w:top w:val="single" w:sz="4" w:color="D9D9D9"/>
-              <w:left w:val="single" w:sz="4" w:color="D9D9D9"/>
-              <w:bottom w:val="single" w:sz="4" w:color="D9D9D9"/>
-              <w:right w:val="single" w:sz="4" w:color="D9D9D9"/>
-            </w:tcBorders>
-          </w:tcPr>
-          <w:p>
-            <w:pPr>
-              <w:spacing w:after="0" w:line="259" w:lineRule="auto"/>
-              <w:jc w:val="left"/>
-            </w:pPr>
-            <w:r>
-              <w:rPr>
-                <w:b/>
-                <w:sz w:val="20"/>
-              </w:rPr>
-              <w:t>Approach</w:t>
-            </w:r>
-          </w:p>
-        </w:tc>
-        <w:tc>
-          <w:tcPr>
-            <w:tcW w:type="dxa" w:w="2304"/>
-            <w:vAlign w:val="center"/>
-            <w:tcMar>
-              <w:top w:w="90" w:type="dxa"/>
-              <w:bottom w:w="90" w:type="dxa"/>
-              <w:left w:w="100" w:type="dxa"/>
-              <w:right w:w="100" w:type="dxa"/>
-            </w:tcMar>
-            <w:shd w:fill="E7EBEF"/>
-            <w:tcBorders>
-              <w:top w:val="single" w:sz="4" w:color="D9D9D9"/>
-              <w:left w:val="single" w:sz="4" w:color="D9D9D9"/>
-              <w:bottom w:val="single" w:sz="4" w:color="D9D9D9"/>
-              <w:right w:val="single" w:sz="4" w:color="D9D9D9"/>
-            </w:tcBorders>
-          </w:tcPr>
-          <w:p>
-            <w:pPr>
-              <w:spacing w:after="0" w:line="259" w:lineRule="auto"/>
-              <w:jc w:val="center"/>
-            </w:pPr>
-            <w:r>
-              <w:rPr>
-                <w:b/>
-                <w:sz w:val="20"/>
-              </w:rPr>
-              <w:t>Geographic output</w:t>
-            </w:r>
-          </w:p>
-        </w:tc>
-        <w:tc>
-          <w:tcPr>
-            <w:tcW w:type="dxa" w:w="3697"/>
-            <w:vAlign w:val="center"/>
-            <w:tcMar>
-              <w:top w:w="90" w:type="dxa"/>
-              <w:bottom w:w="90" w:type="dxa"/>
-              <w:left w:w="100" w:type="dxa"/>
-              <w:right w:w="100" w:type="dxa"/>
-            </w:tcMar>
-            <w:shd w:fill="E7EBEF"/>
-            <w:tcBorders>
-              <w:top w:val="single" w:sz="4" w:color="D9D9D9"/>
-              <w:left w:val="single" w:sz="4" w:color="D9D9D9"/>
-              <w:bottom w:val="single" w:sz="4" w:color="D9D9D9"/>
-              <w:right w:val="single" w:sz="4" w:color="D9D9D9"/>
-            </w:tcBorders>
-          </w:tcPr>
-          <w:p>
-            <w:pPr>
-              <w:spacing w:after="0" w:line="259" w:lineRule="auto"/>
-              <w:jc w:val="center"/>
-            </w:pPr>
-            <w:r>
-              <w:rPr>
-                <w:b/>
-                <w:sz w:val="20"/>
-              </w:rPr>
-              <w:t>Evidence available at inference</w:t>
-            </w:r>
-          </w:p>
-        </w:tc>
-      </w:tr>
-      <w:tr>
-        <w:trPr>
-          <w:cantSplit/>
-        </w:trPr>
-        <w:tc>
-          <w:tcPr>
-            <w:tcW w:type="dxa" w:w="3024"/>
-            <w:vAlign w:val="center"/>
-            <w:tcMar>
-              <w:top w:w="90" w:type="dxa"/>
-              <w:bottom w:w="90" w:type="dxa"/>
-              <w:left w:w="100" w:type="dxa"/>
-              <w:right w:w="100" w:type="dxa"/>
-            </w:tcMar>
-            <w:shd w:fill="FFFFFF"/>
-            <w:tcBorders>
-              <w:top w:val="single" w:sz="4" w:color="D9D9D9"/>
-              <w:left w:val="single" w:sz="4" w:color="D9D9D9"/>
-              <w:bottom w:val="single" w:sz="4" w:color="D9D9D9"/>
-              <w:right w:val="single" w:sz="4" w:color="D9D9D9"/>
-            </w:tcBorders>
-          </w:tcPr>
-          <w:p>
-            <w:pPr>
-              <w:spacing w:after="0" w:line="259" w:lineRule="auto"/>
-              <w:jc w:val="left"/>
-            </w:pPr>
-            <w:r>
-              <w:rPr>
-                <w:b w:val="0"/>
-                <w:sz w:val="20"/>
-              </w:rPr>
-              <w:t>Regional cell classifier</w:t>
-            </w:r>
-          </w:p>
-        </w:tc>
-        <w:tc>
-          <w:tcPr>
-            <w:tcW w:type="dxa" w:w="2304"/>
-            <w:vAlign w:val="center"/>
-            <w:tcMar>
-              <w:top w:w="90" w:type="dxa"/>
-              <w:bottom w:w="90" w:type="dxa"/>
-              <w:left w:w="100" w:type="dxa"/>
-              <w:right w:w="100" w:type="dxa"/>
-            </w:tcMar>
-            <w:shd w:fill="FFFFFF"/>
-            <w:tcBorders>
-              <w:top w:val="single" w:sz="4" w:color="D9D9D9"/>
-              <w:left w:val="single" w:sz="4" w:color="D9D9D9"/>
-              <w:bottom w:val="single" w:sz="4" w:color="D9D9D9"/>
-              <w:right w:val="single" w:sz="4" w:color="D9D9D9"/>
-            </w:tcBorders>
-          </w:tcPr>
-          <w:p>
-            <w:pPr>
-              <w:spacing w:after="0" w:line="259" w:lineRule="auto"/>
-              <w:jc w:val="center"/>
-            </w:pPr>
-            <w:r>
-              <w:rPr>
-                <w:b w:val="0"/>
-                <w:sz w:val="20"/>
-              </w:rPr>
-              <w:t>One of 300 centers</w:t>
-            </w:r>
-          </w:p>
-        </w:tc>
-        <w:tc>
-          <w:tcPr>
-            <w:tcW w:type="dxa" w:w="3697"/>
-            <w:vAlign w:val="center"/>
-            <w:tcMar>
-              <w:top w:w="90" w:type="dxa"/>
-              <w:bottom w:w="90" w:type="dxa"/>
-              <w:left w:w="100" w:type="dxa"/>
-              <w:right w:w="100" w:type="dxa"/>
-            </w:tcMar>
-            <w:shd w:fill="FFFFFF"/>
-            <w:tcBorders>
-              <w:top w:val="single" w:sz="4" w:color="D9D9D9"/>
-              <w:left w:val="single" w:sz="4" w:color="D9D9D9"/>
-              <w:bottom w:val="single" w:sz="4" w:color="D9D9D9"/>
-              <w:right w:val="single" w:sz="4" w:color="D9D9D9"/>
-            </w:tcBorders>
-          </w:tcPr>
-          <w:p>
-            <w:pPr>
-              <w:spacing w:after="0" w:line="259" w:lineRule="auto"/>
-              <w:jc w:val="center"/>
-            </w:pPr>
-            <w:r>
-              <w:rPr>
-                <w:b w:val="0"/>
-                <w:sz w:val="20"/>
-              </w:rPr>
-              <w:t>Learned image-to-class weights</w:t>
-            </w:r>
-          </w:p>
-        </w:tc>
-      </w:tr>
-      <w:tr>
-        <w:trPr>
-          <w:cantSplit/>
-        </w:trPr>
-        <w:tc>
-          <w:tcPr>
-            <w:tcW w:type="dxa" w:w="3024"/>
-            <w:vAlign w:val="center"/>
-            <w:tcMar>
-              <w:top w:w="90" w:type="dxa"/>
-              <w:bottom w:w="90" w:type="dxa"/>
-              <w:left w:w="100" w:type="dxa"/>
-              <w:right w:w="100" w:type="dxa"/>
-            </w:tcMar>
-            <w:shd w:fill="F6F7F8"/>
-            <w:tcBorders>
-              <w:top w:val="single" w:sz="4" w:color="D9D9D9"/>
-              <w:left w:val="single" w:sz="4" w:color="D9D9D9"/>
-              <w:bottom w:val="single" w:sz="4" w:color="D9D9D9"/>
-              <w:right w:val="single" w:sz="4" w:color="D9D9D9"/>
-            </w:tcBorders>
-          </w:tcPr>
-          <w:p>
-            <w:pPr>
-              <w:spacing w:after="0" w:line="259" w:lineRule="auto"/>
-              <w:jc w:val="left"/>
-            </w:pPr>
-            <w:r>
-              <w:rPr>
-                <w:b w:val="0"/>
-                <w:sz w:val="20"/>
-              </w:rPr>
-              <w:t>Regional classifier plus KNN</w:t>
-            </w:r>
-          </w:p>
-        </w:tc>
-        <w:tc>
-          <w:tcPr>
-            <w:tcW w:type="dxa" w:w="2304"/>
-            <w:vAlign w:val="center"/>
-            <w:tcMar>
-              <w:top w:w="90" w:type="dxa"/>
-              <w:bottom w:w="90" w:type="dxa"/>
-              <w:left w:w="100" w:type="dxa"/>
-              <w:right w:w="100" w:type="dxa"/>
-            </w:tcMar>
-            <w:shd w:fill="F6F7F8"/>
-            <w:tcBorders>
-              <w:top w:val="single" w:sz="4" w:color="D9D9D9"/>
-              <w:left w:val="single" w:sz="4" w:color="D9D9D9"/>
-              <w:bottom w:val="single" w:sz="4" w:color="D9D9D9"/>
-              <w:right w:val="single" w:sz="4" w:color="D9D9D9"/>
-            </w:tcBorders>
-          </w:tcPr>
-          <w:p>
-            <w:pPr>
-              <w:spacing w:after="0" w:line="259" w:lineRule="auto"/>
-              <w:jc w:val="center"/>
-            </w:pPr>
-            <w:r>
-              <w:rPr>
-                <w:b w:val="0"/>
-                <w:sz w:val="20"/>
-              </w:rPr>
-              <w:t>One of 300 centers</w:t>
-            </w:r>
-          </w:p>
-        </w:tc>
-        <w:tc>
-          <w:tcPr>
-            <w:tcW w:type="dxa" w:w="3697"/>
-            <w:vAlign w:val="center"/>
-            <w:tcMar>
-              <w:top w:w="90" w:type="dxa"/>
-              <w:bottom w:w="90" w:type="dxa"/>
-              <w:left w:w="100" w:type="dxa"/>
-              <w:right w:w="100" w:type="dxa"/>
-            </w:tcMar>
-            <w:shd w:fill="F6F7F8"/>
-            <w:tcBorders>
-              <w:top w:val="single" w:sz="4" w:color="D9D9D9"/>
-              <w:left w:val="single" w:sz="4" w:color="D9D9D9"/>
-              <w:bottom w:val="single" w:sz="4" w:color="D9D9D9"/>
-              <w:right w:val="single" w:sz="4" w:color="D9D9D9"/>
-            </w:tcBorders>
-          </w:tcPr>
-          <w:p>
-            <w:pPr>
-              <w:spacing w:after="0" w:line="259" w:lineRule="auto"/>
-              <w:jc w:val="center"/>
-            </w:pPr>
-            <w:r>
-              <w:rPr>
-                <w:b w:val="0"/>
-                <w:sz w:val="20"/>
-              </w:rPr>
-              <w:t>Classifier scores and similar training class labels</w:t>
-            </w:r>
-          </w:p>
-        </w:tc>
-      </w:tr>
-      <w:tr>
-        <w:trPr>
-          <w:cantSplit/>
-        </w:trPr>
-        <w:tc>
-          <w:tcPr>
-            <w:tcW w:type="dxa" w:w="3024"/>
-            <w:vAlign w:val="center"/>
-            <w:tcMar>
-              <w:top w:w="90" w:type="dxa"/>
-              <w:bottom w:w="90" w:type="dxa"/>
-              <w:left w:w="100" w:type="dxa"/>
-              <w:right w:w="100" w:type="dxa"/>
-            </w:tcMar>
-            <w:shd w:fill="FFFFFF"/>
-            <w:tcBorders>
-              <w:top w:val="single" w:sz="4" w:color="D9D9D9"/>
-              <w:left w:val="single" w:sz="4" w:color="D9D9D9"/>
-              <w:bottom w:val="single" w:sz="4" w:color="D9D9D9"/>
-              <w:right w:val="single" w:sz="4" w:color="D9D9D9"/>
-            </w:tcBorders>
-          </w:tcPr>
-          <w:p>
-            <w:pPr>
-              <w:spacing w:after="0" w:line="259" w:lineRule="auto"/>
-              <w:jc w:val="left"/>
-            </w:pPr>
-            <w:r>
-              <w:rPr>
-                <w:b w:val="0"/>
-                <w:sz w:val="20"/>
-              </w:rPr>
-              <w:t>Deployed descriptor retrieval</w:t>
-            </w:r>
-          </w:p>
-        </w:tc>
-        <w:tc>
-          <w:tcPr>
-            <w:tcW w:type="dxa" w:w="2304"/>
-            <w:vAlign w:val="center"/>
-            <w:tcMar>
-              <w:top w:w="90" w:type="dxa"/>
-              <w:bottom w:w="90" w:type="dxa"/>
-              <w:left w:w="100" w:type="dxa"/>
-              <w:right w:w="100" w:type="dxa"/>
-            </w:tcMar>
-            <w:shd w:fill="FFFFFF"/>
-            <w:tcBorders>
-              <w:top w:val="single" w:sz="4" w:color="D9D9D9"/>
-              <w:left w:val="single" w:sz="4" w:color="D9D9D9"/>
-              <w:bottom w:val="single" w:sz="4" w:color="D9D9D9"/>
-              <w:right w:val="single" w:sz="4" w:color="D9D9D9"/>
-            </w:tcBorders>
-          </w:tcPr>
-          <w:p>
-            <w:pPr>
-              <w:spacing w:after="0" w:line="259" w:lineRule="auto"/>
-              <w:jc w:val="center"/>
-            </w:pPr>
-            <w:r>
-              <w:rPr>
-                <w:b w:val="0"/>
-                <w:sz w:val="20"/>
-              </w:rPr>
-              <w:t>One training-reference GPS</w:t>
-            </w:r>
-          </w:p>
-        </w:tc>
-        <w:tc>
-          <w:tcPr>
-            <w:tcW w:type="dxa" w:w="3697"/>
-            <w:vAlign w:val="center"/>
-            <w:tcMar>
-              <w:top w:w="90" w:type="dxa"/>
-              <w:bottom w:w="90" w:type="dxa"/>
-              <w:left w:w="100" w:type="dxa"/>
-              <w:right w:w="100" w:type="dxa"/>
-            </w:tcMar>
-            <w:shd w:fill="FFFFFF"/>
-            <w:tcBorders>
-              <w:top w:val="single" w:sz="4" w:color="D9D9D9"/>
-              <w:left w:val="single" w:sz="4" w:color="D9D9D9"/>
-              <w:bottom w:val="single" w:sz="4" w:color="D9D9D9"/>
-              <w:right w:val="single" w:sz="4" w:color="D9D9D9"/>
-            </w:tcBorders>
-          </w:tcPr>
-          <w:p>
-            <w:pPr>
-              <w:spacing w:after="0" w:line="259" w:lineRule="auto"/>
-              <w:jc w:val="center"/>
-            </w:pPr>
-            <w:r>
-              <w:rPr>
-                <w:b w:val="0"/>
-                <w:sz w:val="20"/>
-              </w:rPr>
-              <w:t>Combined ground-image descriptors</w:t>
-            </w:r>
-          </w:p>
-        </w:tc>
-      </w:tr>
-      <w:tr>
-        <w:trPr>
-          <w:cantSplit/>
-        </w:trPr>
-        <w:tc>
-          <w:tcPr>
-            <w:tcW w:type="dxa" w:w="3024"/>
-            <w:vAlign w:val="center"/>
-            <w:tcMar>
-              <w:top w:w="90" w:type="dxa"/>
-              <w:bottom w:w="90" w:type="dxa"/>
-              <w:left w:w="100" w:type="dxa"/>
-              <w:right w:w="100" w:type="dxa"/>
-            </w:tcMar>
-            <w:shd w:fill="F6F7F8"/>
-            <w:tcBorders>
-              <w:top w:val="single" w:sz="4" w:color="D9D9D9"/>
-              <w:left w:val="single" w:sz="4" w:color="D9D9D9"/>
-              <w:bottom w:val="single" w:sz="4" w:color="D9D9D9"/>
-              <w:right w:val="single" w:sz="4" w:color="D9D9D9"/>
-            </w:tcBorders>
-          </w:tcPr>
-          <w:p>
-            <w:pPr>
-              <w:spacing w:after="0" w:line="259" w:lineRule="auto"/>
-              <w:jc w:val="left"/>
-            </w:pPr>
-            <w:r>
-              <w:rPr>
-                <w:b w:val="0"/>
-                <w:sz w:val="20"/>
-              </w:rPr>
-              <w:t>ETH ground and aerial method</w:t>
-            </w:r>
-          </w:p>
-        </w:tc>
-        <w:tc>
-          <w:tcPr>
-            <w:tcW w:type="dxa" w:w="2304"/>
-            <w:vAlign w:val="center"/>
-            <w:tcMar>
-              <w:top w:w="90" w:type="dxa"/>
-              <w:bottom w:w="90" w:type="dxa"/>
-              <w:left w:w="100" w:type="dxa"/>
-              <w:right w:w="100" w:type="dxa"/>
-            </w:tcMar>
-            <w:shd w:fill="F6F7F8"/>
-            <w:tcBorders>
-              <w:top w:val="single" w:sz="4" w:color="D9D9D9"/>
-              <w:left w:val="single" w:sz="4" w:color="D9D9D9"/>
-              <w:bottom w:val="single" w:sz="4" w:color="D9D9D9"/>
-              <w:right w:val="single" w:sz="4" w:color="D9D9D9"/>
-            </w:tcBorders>
-          </w:tcPr>
-          <w:p>
-            <w:pPr>
-              <w:spacing w:after="0" w:line="259" w:lineRule="auto"/>
-              <w:jc w:val="center"/>
-            </w:pPr>
-            <w:r>
-              <w:rPr>
-                <w:b w:val="0"/>
-                <w:sz w:val="20"/>
-              </w:rPr>
-              <w:t>Fine geographic cell</w:t>
-            </w:r>
-          </w:p>
-        </w:tc>
-        <w:tc>
-          <w:tcPr>
-            <w:tcW w:type="dxa" w:w="3697"/>
-            <w:vAlign w:val="center"/>
-            <w:tcMar>
-              <w:top w:w="90" w:type="dxa"/>
-              <w:bottom w:w="90" w:type="dxa"/>
-              <w:left w:w="100" w:type="dxa"/>
-              <w:right w:w="100" w:type="dxa"/>
-            </w:tcMar>
-            <w:shd w:fill="F6F7F8"/>
-            <w:tcBorders>
-              <w:top w:val="single" w:sz="4" w:color="D9D9D9"/>
-              <w:left w:val="single" w:sz="4" w:color="D9D9D9"/>
-              <w:bottom w:val="single" w:sz="4" w:color="D9D9D9"/>
-              <w:right w:val="single" w:sz="4" w:color="D9D9D9"/>
-            </w:tcBorders>
-          </w:tcPr>
-          <w:p>
-            <w:pPr>
-              <w:spacing w:after="0" w:line="259" w:lineRule="auto"/>
-              <w:jc w:val="center"/>
-            </w:pPr>
-            <w:r>
-              <w:rPr>
-                <w:b w:val="0"/>
-                <w:sz w:val="20"/>
-              </w:rPr>
-              <w:t>Learned prototypes fused with overhead imagery</w:t>
-            </w:r>
-          </w:p>
-        </w:tc>
-      </w:tr>
-    </w:tbl>
-    <w:p>
-      <w:pPr>
-        <w:spacing w:after="60" w:line="60" w:lineRule="exact"/>
-      </w:pPr>
-      <w:r>
-        <w:rPr>
-          <w:sz w:val="6"/>
-        </w:rPr>
+        <w:t>Lindenberger et al. combine learned ground-view prototypes with aerial embeddings and fine S2 cell codes. Their method retrieves a geographic cell code, whereas ours retrieves a training photograph using ground-image features. We do not implement their aerial branch or reproduce their training procedure. Their European benchmark differs from our Kerala-area subset, so the reported accuracies are not directly comparable. [5]</w:t>
       </w:r>
     </w:p>
     <w:p>
       <w:pPr>
+        <w:pStyle w:val="Heading2"/>
         <w:widowControl/>
       </w:pPr>
       <w:r>
         <w:rPr>
           <w:b w:val="0"/>
         </w:rPr>
-        <w:t>Table 5. Methodological comparison. This table compares output structure and evidence, not benchmark accuracy. Methods use different geographic extents, data volumes and evaluation conditions.</w:t>
+        <w:t>Limitations and further work</w:t>
       </w:r>
     </w:p>
     <w:p>
       <w:pPr>
-        <w:pStyle w:val="Heading2"/>
         <w:widowControl/>
       </w:pPr>
       <w:r>
         <w:rPr>
           <w:b w:val="0"/>
         </w:rPr>
-        <w:t>What the project improves and what it does not</w:t>
+        <w:t>Uneven reference coverage, similar scenes in distant locations and nearby validation images limit generalization. Every official test position is more than 1 km from every training reference, so top-one reference lookup cannot achieve sub-kilometer error on this subset. Cell centers can lie between training positions and do not share that exact restriction. [7]</w:t>
       </w:r>
     </w:p>
     <w:p>
@@ -4912,105 +3433,12 @@
         <w:rPr>
           <w:b w:val="0"/>
         </w:rPr>
-        <w:t>The default method removes the 300-center bottleneck and displays a matched reference for inspection. Equal weighting balances the two encoders despite their different descriptor dimensions. The model selects a reference for an unseen query using learned appearance features, then copies its GPS metadata. It does not generate novel coordinates; displayed decimal precision does not establish camera-position accuracy.</w:t>
+        <w:t>The regional system always returns a candidate; it has no validated detector for foreign or unlocalizable images. Cosine similarity and classifier scores are not calibrated probabilities of geographic correctness. Further work should prioritize reviewed reference coverage and an untouched test split separated by route, location and time before exploring aerial features or geometric verification.</w:t>
       </w:r>
     </w:p>
     <w:p>
       <w:pPr>
-        <w:pStyle w:val="Heading2"/>
-        <w:pageBreakBefore/>
-        <w:widowControl/>
-      </w:pPr>
-      <w:r>
-        <w:rPr>
-          <w:b w:val="0"/>
-        </w:rPr>
-        <w:t>Experiments that were not deployed</w:t>
-      </w:r>
-    </w:p>
-    <w:p>
-      <w:pPr>
-        <w:widowControl/>
-      </w:pPr>
-      <w:r>
-        <w:rPr>
-          <w:b w:val="0"/>
-        </w:rPr>
-        <w:t>We implemented a bounded ground-only prototype adaptation using geographic grids, bilinear boundary interpolation and a multi-similarity-style prototype objective with frozen ResNet-DINO features. Direct prototype-coordinate output was weaker on validation. A selected prototype-context re-ranker improved reused-test within-25-km success from 63.03% to 65.83% and median error from 15.92 to 15.57 km, but reduced within-5-km success from 17.37% to 16.53%. It failed the saved fine-precision regression condition and was not installed in the live path. The selected re-ranker used averaged prototype initialization rather than optimized prototype weights. Candidate eligibility filtering was corrected after validation inspection and before that test; this amendment is recorded, making the result explicitly exploratory. [9]</w:t>
-      </w:r>
-    </w:p>
-    <w:p>
-      <w:pPr>
-        <w:widowControl/>
-      </w:pPr>
-      <w:r>
-        <w:rPr>
-          <w:b w:val="0"/>
-        </w:rPr>
-        <w:t>Additional-data work encoded 789 unique Panoramax candidates from 936 source records without retaining full image downloads. Review found menus, indoor scenes and repeated road views among candidates. A reviewed, spatially filtered and thinned 24-reference expansion left validation unchanged and was not promoted. Acquiring or encoding data is therefore reported separately from improving the deployed model. Storage-efficient frozen-feature extraction is useful, but deleting and re-downloading every image each training epoch would not automatically accelerate full encoder training. [9, 10]</w:t>
-      </w:r>
-    </w:p>
-    <w:p>
-      <w:pPr>
-        <w:pStyle w:val="Heading2"/>
-        <w:widowControl/>
-      </w:pPr>
-      <w:r>
-        <w:rPr>
-          <w:b w:val="0"/>
-        </w:rPr>
-        <w:t>Generalization and failure modes</w:t>
-      </w:r>
-    </w:p>
-    <w:p>
-      <w:pPr>
-        <w:widowControl/>
-      </w:pPr>
-      <w:r>
-        <w:rPr>
-          <w:b w:val="0"/>
-        </w:rPr>
-        <w:t>The main limitations are sparse references, similar appearances across distant locations, uncertain GPS labels, street-imagery bias and optimistic nearby validation scenes. Exact-ID separation prevents one obvious form of leakage but cannot establish sequence or geographic independence. A future split should be fixed by capture route and date, with explicit geographic exclusion, before further fitting or model selection.</w:t>
-      </w:r>
-    </w:p>
-    <w:p>
-      <w:pPr>
-        <w:widowControl/>
-      </w:pPr>
-      <w:r>
-        <w:rPr>
-          <w:b w:val="0"/>
-        </w:rPr>
-        <w:t>The regional pipeline has no validated out-of-distribution detector. A photograph of a foreign landmark can still receive a regional match even at a high cosine score. Restricting the map or adding class votes does not solve this problem. We also do not infer a calibrated probability that a query is within 5 or 25 km. Cell boxes are geographic extents, and the displayed reference is inspectable evidence rather than geometric verification.</w:t>
-      </w:r>
-    </w:p>
-    <w:p>
-      <w:pPr>
-        <w:pStyle w:val="Heading2"/>
-        <w:widowControl/>
-      </w:pPr>
-      <w:r>
-        <w:rPr>
-          <w:b w:val="0"/>
-        </w:rPr>
-        <w:t>Further work</w:t>
-      </w:r>
-    </w:p>
-    <w:p>
-      <w:pPr>
-        <w:widowControl/>
-      </w:pPr>
-      <w:r>
-        <w:rPr>
-          <w:b w:val="0"/>
-        </w:rPr>
-        <w:t>The next priorities are more evenly distributed, reviewed reference routes and a new untouched spatial and temporal test set. Once relevant visual overlap exists, local feature correspondences and geometric verification could help reject misleading global matches. Cross-view learning with licensed, aligned high-resolution aerial imagery is a larger extension. A smaller geographic cell alone cannot supply the visual evidence or evaluation independence needed for reliable meter-scale localization.</w:t>
-      </w:r>
-    </w:p>
-    <w:p>
-      <w:pPr>
         <w:pStyle w:val="Heading1"/>
-        <w:pageBreakBefore/>
         <w:widowControl/>
       </w:pPr>
       <w:r>
@@ -5028,63 +3456,7 @@
         <w:rPr>
           <w:b w:val="0"/>
         </w:rPr>
-        <w:t>KPlaceNet provides a working Kerala-area visual geolocation pipeline that connects pretrained image encoders, geographic labels, reference retrieval and an interactive application. The current system exposes three regional methods with distinct output meanings. Classifier-only and classifier-plus-KNN select geographic cells and return their centers. The default ResNet-DINO method retrieves a training reference and returns its recorded coordinate.</w:t>
-      </w:r>
-    </w:p>
-    <w:p>
-      <w:pPr>
-        <w:widowControl/>
-      </w:pPr>
-      <w:r>
-        <w:rPr>
-          <w:b w:val="0"/>
-        </w:rPr>
-        <w:t>On the reused official subset of 357 test photographs, the deployed fine method reaches 63.03% within 25 km, 17.37% within 5 km and a median error of 15.92 km. The classifier-plus-neighbor option reaches 53.50% within 25 km with a 21.84-km median. These measurements show a useful regional improvement while making clear that the project is not an exact street-address locator. The absence of sub-kilometer reference coverage in the official subset imposes a specific limit on top-one coordinate lookup.</w:t>
-      </w:r>
-    </w:p>
-    <w:p>
-      <w:pPr>
-        <w:widowControl/>
-      </w:pPr>
-      <w:r>
-        <w:rPr>
-          <w:b w:val="0"/>
-        </w:rPr>
-        <w:t>The analysis also shows why data and evaluation design matter as much as the choice of encoder. Random validation contains many near-training locations, training class frequencies are uneven, and several prototype or additional-data attempts do not improve fine-precision deployment criteria. Retaining a stable method after an unsuccessful experiment is part of a defensible experimental process, not an absence of work.</w:t>
-      </w:r>
-    </w:p>
-    <w:p>
-      <w:pPr>
-        <w:widowControl/>
-      </w:pPr>
-      <w:r>
-        <w:rPr>
-          <w:b w:val="0"/>
-        </w:rPr>
-        <w:t>Our contribution is an implemented and inspectable regional system, a clear account of the KNN class blend versus fine reference retrieval, and evidence that connects software behavior to measured geographic error. Future development should prioritize reviewed geographic coverage, independent route and date evaluation, and verification of promising image matches before claiming substantially finer localization.</w:t>
-      </w:r>
-    </w:p>
-    <w:p>
-      <w:pPr>
-        <w:pStyle w:val="Heading2"/>
-        <w:widowControl/>
-      </w:pPr>
-      <w:r>
-        <w:rPr>
-          <w:b w:val="0"/>
-        </w:rPr>
-        <w:t>Implementation and reproducibility record</w:t>
-      </w:r>
-    </w:p>
-    <w:p>
-      <w:pPr>
-        <w:widowControl/>
-      </w:pPr>
-      <w:r>
-        <w:rPr>
-          <w:b w:val="0"/>
-        </w:rPr>
-        <w:t>The evaluated implementation is available in the contributor repository at code revision a45a0d89beba92cd0a07cc0dbef267ffbd525654. The default model assets are distributed through the verified Kerala fine-retrieval release; large weights are not embedded in Git history. The committed dataset split audit, selection records, per-query predictions and deployment fingerprints provide the basis for the reported metrics. Experimental prototype evidence is recorded separately and does not change the deployed pipeline. [6, 7, 9]</w:t>
+        <w:t>KPlaceNet implements three Kerala-area geolocation methods: 300-cell classification, classification with five-neighbor voting, and combined ResNet-DINO reference retrieval. The default retrieval method achieves 63.03% within 25 km and a 15.92-km median error on 357 reused official test images, compared with 47.62% and 28.41 km for classification alone. It improves measured regional localization while remaining a lookup over reference GPS positions. More independent evaluation and denser, balanced reference coverage are needed before claiming reliable street-level precision. [7]</w:t>
       </w:r>
     </w:p>
     <w:p>
@@ -5110,7 +3482,7 @@
           <w:b w:val="0"/>
           <w:sz w:val="20"/>
         </w:rPr>
-        <w:t>[1] G Astruc, N Dufour, I Siglidis et al. OpenStreetView-5M The Many Roads to Global Visual Geolocation. CVPR, 2024. Project and dataset description: https://osv5m.github.io/ .</w:t>
+        <w:t>[1] G. Astruc, N. Dufour, I. Siglidis et al., "OpenStreetView-5M: The Many Roads to Global Visual Geolocation," Proceedings of CVPR, 2024. Official project: https://osv5m.github.io/ .</w:t>
       </w:r>
     </w:p>
     <w:p>
@@ -5123,7 +3495,7 @@
           <w:b w:val="0"/>
           <w:sz w:val="20"/>
         </w:rPr>
-        <w:t>[2] K He, X Zhang, S Ren and J Sun. Deep Residual Learning for Image Recognition. CVPR, 2016. Preprint: https://arxiv.org/abs/1512.03385 .</w:t>
+        <w:t>[2] K. He, X. Zhang, S. Ren and J. Sun, "Deep Residual Learning for Image Recognition," Proceedings of CVPR, 2016. Preprint: https://arxiv.org/abs/1512.03385 .</w:t>
       </w:r>
     </w:p>
     <w:p>
@@ -5136,7 +3508,7 @@
           <w:b w:val="0"/>
           <w:sz w:val="20"/>
         </w:rPr>
-        <w:t>[3] M Oquab, T Darcet, T Moutakanni et al. DINOv2 Learning Robust Visual Features without Supervision. arXiv:2304.07193, 2023, revised 2024. https://arxiv.org/abs/2304.07193 . Official code and pretrained models: https://github.com/facebookresearch/dinov2 .</w:t>
+        <w:t>[3] M. Oquab, T. Darcet, T. Moutakanni et al., "DINOv2: Learning Robust Visual Features without Supervision," arXiv:2304.07193, 2023, revised 2024. https://arxiv.org/abs/2304.07193 . Official pretrained models: https://github.com/facebookresearch/dinov2 .</w:t>
       </w:r>
     </w:p>
     <w:p>
@@ -5149,7 +3521,7 @@
           <w:b w:val="0"/>
           <w:sz w:val="20"/>
         </w:rPr>
-        <w:t>[4] T Weyand, I Kostrikov and J Philbin. PlaNet Photo Geolocation with Convolutional Neural Networks. ECCV, 2016. https://arxiv.org/abs/1602.05314 .</w:t>
+        <w:t>[4] T. Weyand, I. Kostrikov and J. Philbin, "PlaNet - Photo Geolocation with Convolutional Neural Networks," Proceedings of ECCV, 2016. https://arxiv.org/abs/1602.05314 .</w:t>
       </w:r>
     </w:p>
     <w:p>
@@ -5162,7 +3534,7 @@
           <w:b w:val="0"/>
           <w:sz w:val="20"/>
         </w:rPr>
-        <w:t>[5] P Lindenberger, P E Sarlin, J Hosang, M Balice, M Pollefeys, S Lynen and E Trulls. Scaling Image Geo-Localization to Continent Level. NeurIPS, 2025. https://arxiv.org/abs/2510.26795 . Project: https://scaling-geoloc.github.io/ .</w:t>
+        <w:t>[5] P. Lindenberger, P.-E. Sarlin, J. Hosang, M. Balice, M. Pollefeys, S. Lynen and E. Trulls, "Scaling Image Geo-Localization to Continent Level," NeurIPS, 2025. https://arxiv.org/abs/2510.26795 . Official project: https://scaling-geoloc.github.io/ .</w:t>
       </w:r>
     </w:p>
     <w:p>
@@ -5175,7 +3547,7 @@
           <w:b w:val="0"/>
           <w:sz w:val="20"/>
         </w:rPr>
-        <w:t>[6] KPlaceNet project implementation. Original repository: https://github.com/Asterisk-Hunter/KPlaceNet . Evaluated contributor revision: https://github.com/Prajwal-k-tech/KPlaceNet/tree/a45a0d89beba92cd0a07cc0dbef267ffbd525654 . Relevant modules: demo/app.py, src/model.py, src/dataset.py, src/retrieval.py and src/fine_inference.py. Accessed 22 October 2026.</w:t>
+        <w:t>[6] KPlaceNet source code, evaluated revision a45a0d8. Original repository: https://github.com/Asterisk-Hunter/KPlaceNet . Evaluated implementation: https://github.com/Prajwal-k-tech/KPlaceNet/tree/a45a0d89beba92cd0a07cc0dbef267ffbd525654 . Relevant modules: demo/app.py, src/model.py, src/dataset.py, src/retrieval.py and src/fine_inference.py. Accessed 22 October 2026.</w:t>
       </w:r>
     </w:p>
     <w:p>
@@ -5188,7 +3560,7 @@
           <w:b w:val="0"/>
           <w:sz w:val="20"/>
         </w:rPr>
-        <w:t>[7] KPlaceNet regional experiment and deployment records. Repository directories docs/results/l6_kerala_20261020, docs/results/l7_kerala_knn_20261020, docs/results/l10_precision_20261021 and docs/results/fine_deployment_20261021. https://github.com/Prajwal-k-tech/KPlaceNet/tree/a45a0d89beba92cd0a07cc0dbef267ffbd525654/docs/results . Includes split audit, recorded selection records and per-query error CSVs. Accessed 22 October 2026.</w:t>
+        <w:t>[7] KPlaceNet project experiment records, revision 1d67d64. https://github.com/Prajwal-k-tech/KPlaceNet/tree/1d67d649544c44c724094a56bbc096cf073a15eb/docs/results . Results: l6_kerala_20261020, l7_kerala_knn_20261020, l10_precision_20261021 and fine_deployment_20261021. Inventory and class counts: report_eda_20261022.json. These are project measurements, not independent published benchmarks. Accessed 22 October 2026.</w:t>
       </w:r>
     </w:p>
     <w:p>
@@ -5201,33 +3573,7 @@
           <w:b w:val="0"/>
           <w:sz w:val="20"/>
         </w:rPr>
-        <w:t>[8] OSV-5M dataset distribution. Hugging Face dataset osv5m/osv5m, revision cff33609b56b54d8743b7ee7a416eb8433e9a681. CC BY-SA 4.0. https://huggingface.co/datasets/osv5m/osv5m . Accessed 22 October 2026.</w:t>
-      </w:r>
-    </w:p>
-    <w:p>
-      <w:pPr>
-        <w:widowControl/>
-        <w:spacing w:line="250" w:lineRule="auto" w:after="180"/>
-      </w:pPr>
-      <w:r>
-        <w:rPr>
-          <w:b w:val="0"/>
-          <w:sz w:val="20"/>
-        </w:rPr>
-        <w:t>[9] KPlaceNet experimental geographic prototypes and additional-data records. docs/results/eth_ground_prototypes_20261021.md and docs/results/panoramax_20261021. https://github.com/Prajwal-k-tech/KPlaceNet/tree/a45a0d89beba92cd0a07cc0dbef267ffbd525654/docs/results . Experimental methods were not deployed. Accessed 22 October 2026.</w:t>
-      </w:r>
-    </w:p>
-    <w:p>
-      <w:pPr>
-        <w:widowControl/>
-        <w:spacing w:line="250" w:lineRule="auto" w:after="180"/>
-      </w:pPr>
-      <w:r>
-        <w:rPr>
-          <w:b w:val="0"/>
-          <w:sz w:val="20"/>
-        </w:rPr>
-        <w:t>[10] Panoramax contributors. Panoramax documentation and federated image metadata. https://docs.panoramax.fr/ . Candidate-specific authors, coordinates, source links and licenses are retained in the encoded metadata manifest. Accessed 22 October 2026.</w:t>
+        <w:t>[8] OSV-5M dataset card and distribution, osv5m/osv5m, revision cff33609b56b54d8743b7ee7a416eb8433e9a681. License: CC BY-SA 4.0. https://huggingface.co/datasets/osv5m/osv5m/tree/cff33609b56b54d8743b7ee7a416eb8433e9a681 . Accessed 22 October 2026.</w:t>
       </w:r>
     </w:p>
     <w:sectPr>

</xml_diff>